<commit_message>
correção frase IQR no relatórios
</commit_message>
<xml_diff>
--- a/report/Relatorio_TecnicasIA_Dilsonei.docx
+++ b/report/Relatorio_TecnicasIA_Dilsonei.docx
@@ -780,14 +780,10 @@
         <w:jc w:val="both"/>
       </w:pPr>
       <w:r>
-        <w:t>•  Exclusão de dados que ultrapassam critérios do método IQR, considerados outliers (fora da faixa de 100</w:t>
-      </w:r>
-      <w:r>
-        <w:t>-</w:t>
-      </w:r>
-      <w:r>
-        <w:t>3.000 kWh/UC/mês);</w:t>
-      </w:r>
+        <w:t>•  Exclusão de outliers pelo método IQR (limites de Q1 − 1,5·IQR e Q3 + 1,5·IQR sobre o consumo por UC), restritos aos limites físicos de 100 a 3.000 kWh/UC/mês; a faixa efetiva resultante foi de 100 a 1.484,5 kWh/UC/mês (5.409 registros removidos);</w:t>
+      </w:r>
+      <w:r/>
+      <w:r/>
     </w:p>
     <w:p>
       <w:pPr>

</xml_diff>